<commit_message>
modif user guide and add comments
</commit_message>
<xml_diff>
--- a/user_guide.docx
+++ b/user_guide.docx
@@ -4,12 +4,175 @@
   <w:body>
     <w:p>
       <w:r>
-        <w:t>This code is for the classification of the orientation of the centriole : top vue, side vue or others.</w:t>
+        <w:t xml:space="preserve">This code </w:t>
+      </w:r>
+      <w:proofErr w:type="spellStart"/>
+      <w:r>
+        <w:t>is</w:t>
+      </w:r>
+      <w:proofErr w:type="spellEnd"/>
+      <w:r>
+        <w:t xml:space="preserve"> for the classification of the orientation of the centriole : top vue, </w:t>
+      </w:r>
+      <w:proofErr w:type="spellStart"/>
+      <w:r>
+        <w:t>side</w:t>
+      </w:r>
+      <w:proofErr w:type="spellEnd"/>
+      <w:r>
+        <w:t xml:space="preserve"> vue or </w:t>
+      </w:r>
+      <w:proofErr w:type="spellStart"/>
+      <w:r>
+        <w:t>others</w:t>
+      </w:r>
+      <w:proofErr w:type="spellEnd"/>
+      <w:r>
+        <w:t>.</w:t>
       </w:r>
     </w:p>
     <w:p>
       <w:r>
-        <w:t>Data : contains a folder set split in 2 folders train and valid, used for training and validation</w:t>
+        <w:t xml:space="preserve">Data : </w:t>
+      </w:r>
+      <w:proofErr w:type="spellStart"/>
+      <w:r>
+        <w:t>contains</w:t>
+      </w:r>
+      <w:proofErr w:type="spellEnd"/>
+      <w:r>
+        <w:t xml:space="preserve"> a </w:t>
+      </w:r>
+      <w:proofErr w:type="spellStart"/>
+      <w:r>
+        <w:t>folder</w:t>
+      </w:r>
+      <w:proofErr w:type="spellEnd"/>
+      <w:r>
+        <w:t xml:space="preserve"> set split in 2 </w:t>
+      </w:r>
+      <w:proofErr w:type="spellStart"/>
+      <w:r>
+        <w:t>folders</w:t>
+      </w:r>
+      <w:proofErr w:type="spellEnd"/>
+      <w:r>
+        <w:t xml:space="preserve"> train and </w:t>
+      </w:r>
+      <w:proofErr w:type="spellStart"/>
+      <w:r>
+        <w:t>valid</w:t>
+      </w:r>
+      <w:proofErr w:type="spellEnd"/>
+      <w:r>
+        <w:t xml:space="preserve">, </w:t>
+      </w:r>
+      <w:proofErr w:type="spellStart"/>
+      <w:r>
+        <w:t>used</w:t>
+      </w:r>
+      <w:proofErr w:type="spellEnd"/>
+      <w:r>
+        <w:t xml:space="preserve"> for training and validation</w:t>
+      </w:r>
+      <w:r>
+        <w:t xml:space="preserve">, and </w:t>
+      </w:r>
+      <w:proofErr w:type="gramStart"/>
+      <w:r>
+        <w:t>a</w:t>
+      </w:r>
+      <w:proofErr w:type="gramEnd"/>
+      <w:r>
+        <w:t xml:space="preserve"> </w:t>
+      </w:r>
+      <w:proofErr w:type="spellStart"/>
+      <w:r>
+        <w:t>txt</w:t>
+      </w:r>
+      <w:proofErr w:type="spellEnd"/>
+      <w:r>
+        <w:t xml:space="preserve"> file label2.txt, labels are 0 for top vue and one for </w:t>
+      </w:r>
+      <w:proofErr w:type="spellStart"/>
+      <w:r>
+        <w:t>side</w:t>
+      </w:r>
+      <w:proofErr w:type="spellEnd"/>
+      <w:r>
+        <w:t xml:space="preserve"> vue. The </w:t>
+      </w:r>
+      <w:proofErr w:type="spellStart"/>
+      <w:r>
+        <w:t>third</w:t>
+      </w:r>
+      <w:proofErr w:type="spellEnd"/>
+      <w:r>
+        <w:t xml:space="preserve"> class </w:t>
+      </w:r>
+      <w:proofErr w:type="spellStart"/>
+      <w:r>
+        <w:t>is</w:t>
+      </w:r>
+      <w:proofErr w:type="spellEnd"/>
+      <w:r>
+        <w:t xml:space="preserve"> not </w:t>
+      </w:r>
+      <w:proofErr w:type="spellStart"/>
+      <w:r>
+        <w:t>managed</w:t>
+      </w:r>
+      <w:proofErr w:type="spellEnd"/>
+      <w:r>
+        <w:t xml:space="preserve"> </w:t>
+      </w:r>
+      <w:proofErr w:type="spellStart"/>
+      <w:r>
+        <w:t>yet</w:t>
+      </w:r>
+      <w:proofErr w:type="spellEnd"/>
+      <w:r>
+        <w:t xml:space="preserve">, </w:t>
+      </w:r>
+      <w:proofErr w:type="spellStart"/>
+      <w:r>
+        <w:t>because</w:t>
+      </w:r>
+      <w:proofErr w:type="spellEnd"/>
+      <w:r>
+        <w:t xml:space="preserve"> </w:t>
+      </w:r>
+      <w:proofErr w:type="spellStart"/>
+      <w:r>
+        <w:t>there</w:t>
+      </w:r>
+      <w:proofErr w:type="spellEnd"/>
+      <w:r>
+        <w:t xml:space="preserve"> </w:t>
+      </w:r>
+      <w:proofErr w:type="spellStart"/>
+      <w:r>
+        <w:t>is</w:t>
+      </w:r>
+      <w:proofErr w:type="spellEnd"/>
+      <w:r>
+        <w:t xml:space="preserve"> to few of </w:t>
+      </w:r>
+      <w:proofErr w:type="spellStart"/>
+      <w:r>
+        <w:t>them</w:t>
+      </w:r>
+      <w:proofErr w:type="spellEnd"/>
+      <w:r>
+        <w:t xml:space="preserve"> in </w:t>
+      </w:r>
+      <w:proofErr w:type="spellStart"/>
+      <w:r>
+        <w:t>our</w:t>
+      </w:r>
+      <w:proofErr w:type="spellEnd"/>
+      <w:r>
+        <w:t xml:space="preserve"> data.</w:t>
       </w:r>
     </w:p>
     <w:p>
@@ -40,7 +203,375 @@
           <w:sz w:val="24"/>
           <w:szCs w:val="24"/>
         </w:rPr>
-        <w:t xml:space="preserve"> contains the definition of the architecture of the neural network used : it is a succession of resnet blocks which progressively diminishes the the shape of the layers while increasing the number of channels. It end swith a fully connected layer combine with a SoftMax activation function. </w:t>
+        <w:t xml:space="preserve"> </w:t>
+      </w:r>
+      <w:proofErr w:type="spellStart"/>
+      <w:r>
+        <w:rPr>
+          <w:sz w:val="24"/>
+          <w:szCs w:val="24"/>
+        </w:rPr>
+        <w:t>contains</w:t>
+      </w:r>
+      <w:proofErr w:type="spellEnd"/>
+      <w:r>
+        <w:rPr>
+          <w:sz w:val="24"/>
+          <w:szCs w:val="24"/>
+        </w:rPr>
+        <w:t xml:space="preserve"> the </w:t>
+      </w:r>
+      <w:proofErr w:type="spellStart"/>
+      <w:r>
+        <w:rPr>
+          <w:sz w:val="24"/>
+          <w:szCs w:val="24"/>
+        </w:rPr>
+        <w:t>definition</w:t>
+      </w:r>
+      <w:proofErr w:type="spellEnd"/>
+      <w:r>
+        <w:rPr>
+          <w:sz w:val="24"/>
+          <w:szCs w:val="24"/>
+        </w:rPr>
+        <w:t xml:space="preserve"> of the architecture of the neural network </w:t>
+      </w:r>
+      <w:proofErr w:type="spellStart"/>
+      <w:r>
+        <w:rPr>
+          <w:sz w:val="24"/>
+          <w:szCs w:val="24"/>
+        </w:rPr>
+        <w:t>used</w:t>
+      </w:r>
+      <w:proofErr w:type="spellEnd"/>
+      <w:r>
+        <w:rPr>
+          <w:sz w:val="24"/>
+          <w:szCs w:val="24"/>
+        </w:rPr>
+        <w:t xml:space="preserve"> : </w:t>
+      </w:r>
+      <w:proofErr w:type="spellStart"/>
+      <w:r>
+        <w:rPr>
+          <w:sz w:val="24"/>
+          <w:szCs w:val="24"/>
+        </w:rPr>
+        <w:t>it</w:t>
+      </w:r>
+      <w:proofErr w:type="spellEnd"/>
+      <w:r>
+        <w:rPr>
+          <w:sz w:val="24"/>
+          <w:szCs w:val="24"/>
+        </w:rPr>
+        <w:t xml:space="preserve"> </w:t>
+      </w:r>
+      <w:proofErr w:type="spellStart"/>
+      <w:r>
+        <w:rPr>
+          <w:sz w:val="24"/>
+          <w:szCs w:val="24"/>
+        </w:rPr>
+        <w:t>is</w:t>
+      </w:r>
+      <w:proofErr w:type="spellEnd"/>
+      <w:r>
+        <w:rPr>
+          <w:sz w:val="24"/>
+          <w:szCs w:val="24"/>
+        </w:rPr>
+        <w:t xml:space="preserve"> a succession of </w:t>
+      </w:r>
+      <w:proofErr w:type="spellStart"/>
+      <w:r>
+        <w:rPr>
+          <w:sz w:val="24"/>
+          <w:szCs w:val="24"/>
+        </w:rPr>
+        <w:t>resnet</w:t>
+      </w:r>
+      <w:proofErr w:type="spellEnd"/>
+      <w:r>
+        <w:rPr>
+          <w:sz w:val="24"/>
+          <w:szCs w:val="24"/>
+        </w:rPr>
+        <w:t xml:space="preserve"> blocks </w:t>
+      </w:r>
+      <w:proofErr w:type="spellStart"/>
+      <w:r>
+        <w:rPr>
+          <w:sz w:val="24"/>
+          <w:szCs w:val="24"/>
+        </w:rPr>
+        <w:t>which</w:t>
+      </w:r>
+      <w:proofErr w:type="spellEnd"/>
+      <w:r>
+        <w:rPr>
+          <w:sz w:val="24"/>
+          <w:szCs w:val="24"/>
+        </w:rPr>
+        <w:t xml:space="preserve"> </w:t>
+      </w:r>
+      <w:proofErr w:type="spellStart"/>
+      <w:r>
+        <w:rPr>
+          <w:sz w:val="24"/>
+          <w:szCs w:val="24"/>
+        </w:rPr>
+        <w:t>progressively</w:t>
+      </w:r>
+      <w:proofErr w:type="spellEnd"/>
+      <w:r>
+        <w:rPr>
+          <w:sz w:val="24"/>
+          <w:szCs w:val="24"/>
+        </w:rPr>
+        <w:t xml:space="preserve"> </w:t>
+      </w:r>
+      <w:proofErr w:type="spellStart"/>
+      <w:r>
+        <w:rPr>
+          <w:sz w:val="24"/>
+          <w:szCs w:val="24"/>
+        </w:rPr>
+        <w:t>diminishes</w:t>
+      </w:r>
+      <w:proofErr w:type="spellEnd"/>
+      <w:r>
+        <w:rPr>
+          <w:sz w:val="24"/>
+          <w:szCs w:val="24"/>
+        </w:rPr>
+        <w:t xml:space="preserve"> the </w:t>
+      </w:r>
+      <w:proofErr w:type="spellStart"/>
+      <w:r>
+        <w:rPr>
+          <w:sz w:val="24"/>
+          <w:szCs w:val="24"/>
+        </w:rPr>
+        <w:t>the</w:t>
+      </w:r>
+      <w:proofErr w:type="spellEnd"/>
+      <w:r>
+        <w:rPr>
+          <w:sz w:val="24"/>
+          <w:szCs w:val="24"/>
+        </w:rPr>
+        <w:t xml:space="preserve"> </w:t>
+      </w:r>
+      <w:proofErr w:type="spellStart"/>
+      <w:r>
+        <w:rPr>
+          <w:sz w:val="24"/>
+          <w:szCs w:val="24"/>
+        </w:rPr>
+        <w:t>shape</w:t>
+      </w:r>
+      <w:proofErr w:type="spellEnd"/>
+      <w:r>
+        <w:rPr>
+          <w:sz w:val="24"/>
+          <w:szCs w:val="24"/>
+        </w:rPr>
+        <w:t xml:space="preserve"> of the </w:t>
+      </w:r>
+      <w:proofErr w:type="spellStart"/>
+      <w:r>
+        <w:rPr>
+          <w:sz w:val="24"/>
+          <w:szCs w:val="24"/>
+        </w:rPr>
+        <w:t>layers</w:t>
+      </w:r>
+      <w:proofErr w:type="spellEnd"/>
+      <w:r>
+        <w:rPr>
+          <w:sz w:val="24"/>
+          <w:szCs w:val="24"/>
+        </w:rPr>
+        <w:t xml:space="preserve"> </w:t>
+      </w:r>
+      <w:proofErr w:type="spellStart"/>
+      <w:r>
+        <w:rPr>
+          <w:sz w:val="24"/>
+          <w:szCs w:val="24"/>
+        </w:rPr>
+        <w:t>while</w:t>
+      </w:r>
+      <w:proofErr w:type="spellEnd"/>
+      <w:r>
+        <w:rPr>
+          <w:sz w:val="24"/>
+          <w:szCs w:val="24"/>
+        </w:rPr>
+        <w:t xml:space="preserve"> </w:t>
+      </w:r>
+      <w:proofErr w:type="spellStart"/>
+      <w:r>
+        <w:rPr>
+          <w:sz w:val="24"/>
+          <w:szCs w:val="24"/>
+        </w:rPr>
+        <w:t>increasing</w:t>
+      </w:r>
+      <w:proofErr w:type="spellEnd"/>
+      <w:r>
+        <w:rPr>
+          <w:sz w:val="24"/>
+          <w:szCs w:val="24"/>
+        </w:rPr>
+        <w:t xml:space="preserve"> the </w:t>
+      </w:r>
+      <w:proofErr w:type="spellStart"/>
+      <w:r>
+        <w:rPr>
+          <w:sz w:val="24"/>
+          <w:szCs w:val="24"/>
+        </w:rPr>
+        <w:t>number</w:t>
+      </w:r>
+      <w:proofErr w:type="spellEnd"/>
+      <w:r>
+        <w:rPr>
+          <w:sz w:val="24"/>
+          <w:szCs w:val="24"/>
+        </w:rPr>
+        <w:t xml:space="preserve"> of </w:t>
+      </w:r>
+      <w:proofErr w:type="spellStart"/>
+      <w:r>
+        <w:rPr>
+          <w:sz w:val="24"/>
+          <w:szCs w:val="24"/>
+        </w:rPr>
+        <w:t>channels</w:t>
+      </w:r>
+      <w:proofErr w:type="spellEnd"/>
+      <w:r>
+        <w:rPr>
+          <w:sz w:val="24"/>
+          <w:szCs w:val="24"/>
+        </w:rPr>
+        <w:t xml:space="preserve">. It end </w:t>
+      </w:r>
+      <w:proofErr w:type="spellStart"/>
+      <w:r>
+        <w:rPr>
+          <w:sz w:val="24"/>
+          <w:szCs w:val="24"/>
+        </w:rPr>
+        <w:t>swith</w:t>
+      </w:r>
+      <w:proofErr w:type="spellEnd"/>
+      <w:r>
+        <w:rPr>
+          <w:sz w:val="24"/>
+          <w:szCs w:val="24"/>
+        </w:rPr>
+        <w:t xml:space="preserve"> </w:t>
+      </w:r>
+      <w:proofErr w:type="gramStart"/>
+      <w:r>
+        <w:rPr>
+          <w:sz w:val="24"/>
+          <w:szCs w:val="24"/>
+        </w:rPr>
+        <w:t>a</w:t>
+      </w:r>
+      <w:proofErr w:type="gramEnd"/>
+      <w:r>
+        <w:rPr>
+          <w:sz w:val="24"/>
+          <w:szCs w:val="24"/>
+        </w:rPr>
+        <w:t xml:space="preserve"> </w:t>
+      </w:r>
+      <w:proofErr w:type="spellStart"/>
+      <w:r>
+        <w:rPr>
+          <w:sz w:val="24"/>
+          <w:szCs w:val="24"/>
+        </w:rPr>
+        <w:t>fully</w:t>
+      </w:r>
+      <w:proofErr w:type="spellEnd"/>
+      <w:r>
+        <w:rPr>
+          <w:sz w:val="24"/>
+          <w:szCs w:val="24"/>
+        </w:rPr>
+        <w:t xml:space="preserve"> </w:t>
+      </w:r>
+      <w:proofErr w:type="spellStart"/>
+      <w:r>
+        <w:rPr>
+          <w:sz w:val="24"/>
+          <w:szCs w:val="24"/>
+        </w:rPr>
+        <w:t>connected</w:t>
+      </w:r>
+      <w:proofErr w:type="spellEnd"/>
+      <w:r>
+        <w:rPr>
+          <w:sz w:val="24"/>
+          <w:szCs w:val="24"/>
+        </w:rPr>
+        <w:t xml:space="preserve"> layer combine </w:t>
+      </w:r>
+      <w:proofErr w:type="spellStart"/>
+      <w:r>
+        <w:rPr>
+          <w:sz w:val="24"/>
+          <w:szCs w:val="24"/>
+        </w:rPr>
+        <w:t>with</w:t>
+      </w:r>
+      <w:proofErr w:type="spellEnd"/>
+      <w:r>
+        <w:rPr>
+          <w:sz w:val="24"/>
+          <w:szCs w:val="24"/>
+        </w:rPr>
+        <w:t xml:space="preserve"> a </w:t>
+      </w:r>
+      <w:proofErr w:type="spellStart"/>
+      <w:r>
+        <w:rPr>
+          <w:sz w:val="24"/>
+          <w:szCs w:val="24"/>
+        </w:rPr>
+        <w:t>SoftMax</w:t>
+      </w:r>
+      <w:proofErr w:type="spellEnd"/>
+      <w:r>
+        <w:rPr>
+          <w:sz w:val="24"/>
+          <w:szCs w:val="24"/>
+        </w:rPr>
+        <w:t xml:space="preserve"> activation </w:t>
+      </w:r>
+      <w:proofErr w:type="spellStart"/>
+      <w:r>
+        <w:rPr>
+          <w:sz w:val="24"/>
+          <w:szCs w:val="24"/>
+        </w:rPr>
+        <w:t>function</w:t>
+      </w:r>
+      <w:proofErr w:type="spellEnd"/>
+      <w:r>
+        <w:rPr>
+          <w:sz w:val="24"/>
+          <w:szCs w:val="24"/>
+        </w:rPr>
+        <w:t xml:space="preserve">. </w:t>
       </w:r>
     </w:p>
     <w:p>
@@ -71,7 +602,119 @@
           <w:sz w:val="24"/>
           <w:szCs w:val="24"/>
         </w:rPr>
-        <w:t xml:space="preserve">train a model with fastai and save it, uses the cross entropy loss function. </w:t>
+        <w:t xml:space="preserve">train a model </w:t>
+      </w:r>
+      <w:proofErr w:type="spellStart"/>
+      <w:r>
+        <w:rPr>
+          <w:sz w:val="24"/>
+          <w:szCs w:val="24"/>
+        </w:rPr>
+        <w:t>with</w:t>
+      </w:r>
+      <w:proofErr w:type="spellEnd"/>
+      <w:r>
+        <w:rPr>
+          <w:sz w:val="24"/>
+          <w:szCs w:val="24"/>
+        </w:rPr>
+        <w:t xml:space="preserve"> </w:t>
+      </w:r>
+      <w:proofErr w:type="spellStart"/>
+      <w:r>
+        <w:rPr>
+          <w:sz w:val="24"/>
+          <w:szCs w:val="24"/>
+        </w:rPr>
+        <w:t>fastai</w:t>
+      </w:r>
+      <w:proofErr w:type="spellEnd"/>
+      <w:r>
+        <w:rPr>
+          <w:sz w:val="24"/>
+          <w:szCs w:val="24"/>
+        </w:rPr>
+        <w:t xml:space="preserve"> and </w:t>
+      </w:r>
+      <w:proofErr w:type="spellStart"/>
+      <w:r>
+        <w:rPr>
+          <w:sz w:val="24"/>
+          <w:szCs w:val="24"/>
+        </w:rPr>
+        <w:t>save</w:t>
+      </w:r>
+      <w:proofErr w:type="spellEnd"/>
+      <w:r>
+        <w:rPr>
+          <w:sz w:val="24"/>
+          <w:szCs w:val="24"/>
+        </w:rPr>
+        <w:t xml:space="preserve"> </w:t>
+      </w:r>
+      <w:proofErr w:type="spellStart"/>
+      <w:r>
+        <w:rPr>
+          <w:sz w:val="24"/>
+          <w:szCs w:val="24"/>
+        </w:rPr>
+        <w:t>it</w:t>
+      </w:r>
+      <w:proofErr w:type="spellEnd"/>
+      <w:r>
+        <w:rPr>
+          <w:sz w:val="24"/>
+          <w:szCs w:val="24"/>
+        </w:rPr>
+        <w:t xml:space="preserve">, uses the cross </w:t>
+      </w:r>
+      <w:proofErr w:type="spellStart"/>
+      <w:r>
+        <w:rPr>
+          <w:sz w:val="24"/>
+          <w:szCs w:val="24"/>
+        </w:rPr>
+        <w:t>entropy</w:t>
+      </w:r>
+      <w:proofErr w:type="spellEnd"/>
+      <w:r>
+        <w:rPr>
+          <w:sz w:val="24"/>
+          <w:szCs w:val="24"/>
+        </w:rPr>
+        <w:t xml:space="preserve"> </w:t>
+      </w:r>
+      <w:proofErr w:type="spellStart"/>
+      <w:r>
+        <w:rPr>
+          <w:sz w:val="24"/>
+          <w:szCs w:val="24"/>
+        </w:rPr>
+        <w:t>loss</w:t>
+      </w:r>
+      <w:proofErr w:type="spellEnd"/>
+      <w:r>
+        <w:rPr>
+          <w:sz w:val="24"/>
+          <w:szCs w:val="24"/>
+        </w:rPr>
+        <w:t xml:space="preserve"> </w:t>
+      </w:r>
+      <w:proofErr w:type="spellStart"/>
+      <w:r>
+        <w:rPr>
+          <w:sz w:val="24"/>
+          <w:szCs w:val="24"/>
+        </w:rPr>
+        <w:t>function</w:t>
+      </w:r>
+      <w:proofErr w:type="spellEnd"/>
+      <w:r>
+        <w:rPr>
+          <w:sz w:val="24"/>
+          <w:szCs w:val="24"/>
+        </w:rPr>
+        <w:t xml:space="preserve">. </w:t>
       </w:r>
     </w:p>
     <w:p>
@@ -94,7 +737,55 @@
           <w:sz w:val="24"/>
           <w:szCs w:val="24"/>
         </w:rPr>
-        <w:t> : tests the model and saves the results in a .txt.</w:t>
+        <w:t xml:space="preserve"> : tests the model and </w:t>
+      </w:r>
+      <w:proofErr w:type="spellStart"/>
+      <w:r>
+        <w:rPr>
+          <w:sz w:val="24"/>
+          <w:szCs w:val="24"/>
+        </w:rPr>
+        <w:t>saves</w:t>
+      </w:r>
+      <w:proofErr w:type="spellEnd"/>
+      <w:r>
+        <w:rPr>
+          <w:sz w:val="24"/>
+          <w:szCs w:val="24"/>
+        </w:rPr>
+        <w:t xml:space="preserve"> the </w:t>
+      </w:r>
+      <w:proofErr w:type="spellStart"/>
+      <w:r>
+        <w:rPr>
+          <w:sz w:val="24"/>
+          <w:szCs w:val="24"/>
+        </w:rPr>
+        <w:t>results</w:t>
+      </w:r>
+      <w:proofErr w:type="spellEnd"/>
+      <w:r>
+        <w:rPr>
+          <w:sz w:val="24"/>
+          <w:szCs w:val="24"/>
+        </w:rPr>
+        <w:t xml:space="preserve"> in a .</w:t>
+      </w:r>
+      <w:proofErr w:type="spellStart"/>
+      <w:r>
+        <w:rPr>
+          <w:sz w:val="24"/>
+          <w:szCs w:val="24"/>
+        </w:rPr>
+        <w:t>txt</w:t>
+      </w:r>
+      <w:proofErr w:type="spellEnd"/>
+      <w:r>
+        <w:rPr>
+          <w:sz w:val="24"/>
+          <w:szCs w:val="24"/>
+        </w:rPr>
+        <w:t>.</w:t>
       </w:r>
     </w:p>
     <w:p>
@@ -120,12 +811,165 @@
         </w:rPr>
         <w:t xml:space="preserve"> : </w:t>
       </w:r>
-      <w:r>
-        <w:rPr>
-          <w:sz w:val="24"/>
-          <w:szCs w:val="24"/>
-        </w:rPr>
-        <w:t>metrics to test the model while training (to be able to plot metrics curves). Currently only accuracy metric works.</w:t>
+      <w:proofErr w:type="spellStart"/>
+      <w:r>
+        <w:rPr>
+          <w:sz w:val="24"/>
+          <w:szCs w:val="24"/>
+        </w:rPr>
+        <w:t>metrics</w:t>
+      </w:r>
+      <w:proofErr w:type="spellEnd"/>
+      <w:r>
+        <w:rPr>
+          <w:sz w:val="24"/>
+          <w:szCs w:val="24"/>
+        </w:rPr>
+        <w:t xml:space="preserve"> to test the model </w:t>
+      </w:r>
+      <w:proofErr w:type="spellStart"/>
+      <w:r>
+        <w:rPr>
+          <w:sz w:val="24"/>
+          <w:szCs w:val="24"/>
+        </w:rPr>
+        <w:t>while</w:t>
+      </w:r>
+      <w:proofErr w:type="spellEnd"/>
+      <w:r>
+        <w:rPr>
+          <w:sz w:val="24"/>
+          <w:szCs w:val="24"/>
+        </w:rPr>
+        <w:t xml:space="preserve"> training (to </w:t>
+      </w:r>
+      <w:proofErr w:type="spellStart"/>
+      <w:r>
+        <w:rPr>
+          <w:sz w:val="24"/>
+          <w:szCs w:val="24"/>
+        </w:rPr>
+        <w:t>be</w:t>
+      </w:r>
+      <w:proofErr w:type="spellEnd"/>
+      <w:r>
+        <w:rPr>
+          <w:sz w:val="24"/>
+          <w:szCs w:val="24"/>
+        </w:rPr>
+        <w:t xml:space="preserve"> able to plot </w:t>
+      </w:r>
+      <w:proofErr w:type="spellStart"/>
+      <w:r>
+        <w:rPr>
+          <w:sz w:val="24"/>
+          <w:szCs w:val="24"/>
+        </w:rPr>
+        <w:t>metrics</w:t>
+      </w:r>
+      <w:proofErr w:type="spellEnd"/>
+      <w:r>
+        <w:rPr>
+          <w:sz w:val="24"/>
+          <w:szCs w:val="24"/>
+        </w:rPr>
+        <w:t xml:space="preserve"> </w:t>
+      </w:r>
+      <w:proofErr w:type="spellStart"/>
+      <w:r>
+        <w:rPr>
+          <w:sz w:val="24"/>
+          <w:szCs w:val="24"/>
+        </w:rPr>
+        <w:t>curves</w:t>
+      </w:r>
+      <w:proofErr w:type="spellEnd"/>
+      <w:r>
+        <w:rPr>
+          <w:sz w:val="24"/>
+          <w:szCs w:val="24"/>
+        </w:rPr>
+        <w:t xml:space="preserve">). </w:t>
+      </w:r>
+      <w:proofErr w:type="spellStart"/>
+      <w:r>
+        <w:rPr>
+          <w:sz w:val="24"/>
+          <w:szCs w:val="24"/>
+        </w:rPr>
+        <w:t>Currently</w:t>
+      </w:r>
+      <w:proofErr w:type="spellEnd"/>
+      <w:r>
+        <w:rPr>
+          <w:sz w:val="24"/>
+          <w:szCs w:val="24"/>
+        </w:rPr>
+        <w:t xml:space="preserve"> </w:t>
+      </w:r>
+      <w:proofErr w:type="spellStart"/>
+      <w:r>
+        <w:rPr>
+          <w:sz w:val="24"/>
+          <w:szCs w:val="24"/>
+        </w:rPr>
+        <w:t>only</w:t>
+      </w:r>
+      <w:proofErr w:type="spellEnd"/>
+      <w:r>
+        <w:rPr>
+          <w:sz w:val="24"/>
+          <w:szCs w:val="24"/>
+        </w:rPr>
+        <w:t xml:space="preserve"> </w:t>
+      </w:r>
+      <w:proofErr w:type="spellStart"/>
+      <w:r>
+        <w:rPr>
+          <w:sz w:val="24"/>
+          <w:szCs w:val="24"/>
+        </w:rPr>
+        <w:t>accuracy</w:t>
+      </w:r>
+      <w:proofErr w:type="spellEnd"/>
+      <w:r>
+        <w:rPr>
+          <w:sz w:val="24"/>
+          <w:szCs w:val="24"/>
+        </w:rPr>
+        <w:t xml:space="preserve"> </w:t>
+      </w:r>
+      <w:proofErr w:type="spellStart"/>
+      <w:r>
+        <w:rPr>
+          <w:sz w:val="24"/>
+          <w:szCs w:val="24"/>
+        </w:rPr>
+        <w:t>metric</w:t>
+      </w:r>
+      <w:proofErr w:type="spellEnd"/>
+      <w:r>
+        <w:rPr>
+          <w:sz w:val="24"/>
+          <w:szCs w:val="24"/>
+        </w:rPr>
+        <w:t xml:space="preserve"> </w:t>
+      </w:r>
+      <w:proofErr w:type="spellStart"/>
+      <w:r>
+        <w:rPr>
+          <w:sz w:val="24"/>
+          <w:szCs w:val="24"/>
+        </w:rPr>
+        <w:t>works</w:t>
+      </w:r>
+      <w:proofErr w:type="spellEnd"/>
+      <w:r>
+        <w:rPr>
+          <w:sz w:val="24"/>
+          <w:szCs w:val="24"/>
+        </w:rPr>
+        <w:t>.</w:t>
       </w:r>
     </w:p>
     <w:p>
@@ -156,7 +1000,103 @@
           <w:sz w:val="24"/>
           <w:szCs w:val="24"/>
         </w:rPr>
-        <w:t xml:space="preserve">train a model and test it, specify image path labels path and training parameters here. </w:t>
+        <w:t xml:space="preserve">train a model and test </w:t>
+      </w:r>
+      <w:proofErr w:type="spellStart"/>
+      <w:r>
+        <w:rPr>
+          <w:sz w:val="24"/>
+          <w:szCs w:val="24"/>
+        </w:rPr>
+        <w:t>it</w:t>
+      </w:r>
+      <w:proofErr w:type="spellEnd"/>
+      <w:r>
+        <w:rPr>
+          <w:sz w:val="24"/>
+          <w:szCs w:val="24"/>
+        </w:rPr>
+        <w:t xml:space="preserve">, </w:t>
+      </w:r>
+      <w:proofErr w:type="spellStart"/>
+      <w:r>
+        <w:rPr>
+          <w:sz w:val="24"/>
+          <w:szCs w:val="24"/>
+        </w:rPr>
+        <w:t>specify</w:t>
+      </w:r>
+      <w:proofErr w:type="spellEnd"/>
+      <w:r>
+        <w:rPr>
+          <w:sz w:val="24"/>
+          <w:szCs w:val="24"/>
+        </w:rPr>
+        <w:t xml:space="preserve"> image </w:t>
+      </w:r>
+      <w:proofErr w:type="spellStart"/>
+      <w:r>
+        <w:rPr>
+          <w:sz w:val="24"/>
+          <w:szCs w:val="24"/>
+        </w:rPr>
+        <w:t>path</w:t>
+      </w:r>
+      <w:proofErr w:type="spellEnd"/>
+      <w:r>
+        <w:rPr>
+          <w:sz w:val="24"/>
+          <w:szCs w:val="24"/>
+        </w:rPr>
+        <w:t xml:space="preserve"> labels </w:t>
+      </w:r>
+      <w:proofErr w:type="spellStart"/>
+      <w:r>
+        <w:rPr>
+          <w:sz w:val="24"/>
+          <w:szCs w:val="24"/>
+        </w:rPr>
+        <w:t>path</w:t>
+      </w:r>
+      <w:proofErr w:type="spellEnd"/>
+      <w:r>
+        <w:rPr>
+          <w:sz w:val="24"/>
+          <w:szCs w:val="24"/>
+        </w:rPr>
+        <w:t xml:space="preserve"> and training </w:t>
+      </w:r>
+      <w:proofErr w:type="spellStart"/>
+      <w:r>
+        <w:rPr>
+          <w:sz w:val="24"/>
+          <w:szCs w:val="24"/>
+        </w:rPr>
+        <w:t>parameters</w:t>
+      </w:r>
+      <w:proofErr w:type="spellEnd"/>
+      <w:r>
+        <w:rPr>
+          <w:sz w:val="24"/>
+          <w:szCs w:val="24"/>
+        </w:rPr>
+        <w:t xml:space="preserve"> </w:t>
+      </w:r>
+      <w:proofErr w:type="spellStart"/>
+      <w:r>
+        <w:rPr>
+          <w:sz w:val="24"/>
+          <w:szCs w:val="24"/>
+        </w:rPr>
+        <w:t>here</w:t>
+      </w:r>
+      <w:proofErr w:type="spellEnd"/>
+      <w:r>
+        <w:rPr>
+          <w:sz w:val="24"/>
+          <w:szCs w:val="24"/>
+        </w:rPr>
+        <w:t xml:space="preserve">. </w:t>
       </w:r>
     </w:p>
     <w:p>
@@ -166,12 +1106,213 @@
           <w:szCs w:val="24"/>
         </w:rPr>
       </w:pPr>
-      <w:r>
-        <w:rPr>
-          <w:sz w:val="24"/>
-          <w:szCs w:val="24"/>
-        </w:rPr>
-        <w:t>With the current training set the convergence is quite random but  when it converges correctly the results are quite good, the only mistakes are on ambiguous data.</w:t>
+      <w:proofErr w:type="spellStart"/>
+      <w:r>
+        <w:rPr>
+          <w:sz w:val="24"/>
+          <w:szCs w:val="24"/>
+        </w:rPr>
+        <w:t>With</w:t>
+      </w:r>
+      <w:proofErr w:type="spellEnd"/>
+      <w:r>
+        <w:rPr>
+          <w:sz w:val="24"/>
+          <w:szCs w:val="24"/>
+        </w:rPr>
+        <w:t xml:space="preserve"> the </w:t>
+      </w:r>
+      <w:proofErr w:type="spellStart"/>
+      <w:r>
+        <w:rPr>
+          <w:sz w:val="24"/>
+          <w:szCs w:val="24"/>
+        </w:rPr>
+        <w:t>current</w:t>
+      </w:r>
+      <w:proofErr w:type="spellEnd"/>
+      <w:r>
+        <w:rPr>
+          <w:sz w:val="24"/>
+          <w:szCs w:val="24"/>
+        </w:rPr>
+        <w:t xml:space="preserve"> training set the convergence </w:t>
+      </w:r>
+      <w:proofErr w:type="spellStart"/>
+      <w:r>
+        <w:rPr>
+          <w:sz w:val="24"/>
+          <w:szCs w:val="24"/>
+        </w:rPr>
+        <w:t>is</w:t>
+      </w:r>
+      <w:proofErr w:type="spellEnd"/>
+      <w:r>
+        <w:rPr>
+          <w:sz w:val="24"/>
+          <w:szCs w:val="24"/>
+        </w:rPr>
+        <w:t xml:space="preserve"> </w:t>
+      </w:r>
+      <w:proofErr w:type="spellStart"/>
+      <w:r>
+        <w:rPr>
+          <w:sz w:val="24"/>
+          <w:szCs w:val="24"/>
+        </w:rPr>
+        <w:t>quite</w:t>
+      </w:r>
+      <w:proofErr w:type="spellEnd"/>
+      <w:r>
+        <w:rPr>
+          <w:sz w:val="24"/>
+          <w:szCs w:val="24"/>
+        </w:rPr>
+        <w:t xml:space="preserve"> </w:t>
+      </w:r>
+      <w:proofErr w:type="spellStart"/>
+      <w:r>
+        <w:rPr>
+          <w:sz w:val="24"/>
+          <w:szCs w:val="24"/>
+        </w:rPr>
+        <w:t>random</w:t>
+      </w:r>
+      <w:proofErr w:type="spellEnd"/>
+      <w:r>
+        <w:rPr>
+          <w:sz w:val="24"/>
+          <w:szCs w:val="24"/>
+        </w:rPr>
+        <w:t xml:space="preserve"> but  </w:t>
+      </w:r>
+      <w:proofErr w:type="spellStart"/>
+      <w:r>
+        <w:rPr>
+          <w:sz w:val="24"/>
+          <w:szCs w:val="24"/>
+        </w:rPr>
+        <w:t>when</w:t>
+      </w:r>
+      <w:proofErr w:type="spellEnd"/>
+      <w:r>
+        <w:rPr>
+          <w:sz w:val="24"/>
+          <w:szCs w:val="24"/>
+        </w:rPr>
+        <w:t xml:space="preserve"> </w:t>
+      </w:r>
+      <w:proofErr w:type="spellStart"/>
+      <w:r>
+        <w:rPr>
+          <w:sz w:val="24"/>
+          <w:szCs w:val="24"/>
+        </w:rPr>
+        <w:t>it</w:t>
+      </w:r>
+      <w:proofErr w:type="spellEnd"/>
+      <w:r>
+        <w:rPr>
+          <w:sz w:val="24"/>
+          <w:szCs w:val="24"/>
+        </w:rPr>
+        <w:t xml:space="preserve"> converges </w:t>
+      </w:r>
+      <w:proofErr w:type="spellStart"/>
+      <w:r>
+        <w:rPr>
+          <w:sz w:val="24"/>
+          <w:szCs w:val="24"/>
+        </w:rPr>
+        <w:t>correctly</w:t>
+      </w:r>
+      <w:proofErr w:type="spellEnd"/>
+      <w:r>
+        <w:rPr>
+          <w:sz w:val="24"/>
+          <w:szCs w:val="24"/>
+        </w:rPr>
+        <w:t xml:space="preserve"> the </w:t>
+      </w:r>
+      <w:proofErr w:type="spellStart"/>
+      <w:r>
+        <w:rPr>
+          <w:sz w:val="24"/>
+          <w:szCs w:val="24"/>
+        </w:rPr>
+        <w:t>results</w:t>
+      </w:r>
+      <w:proofErr w:type="spellEnd"/>
+      <w:r>
+        <w:rPr>
+          <w:sz w:val="24"/>
+          <w:szCs w:val="24"/>
+        </w:rPr>
+        <w:t xml:space="preserve"> are </w:t>
+      </w:r>
+      <w:proofErr w:type="spellStart"/>
+      <w:r>
+        <w:rPr>
+          <w:sz w:val="24"/>
+          <w:szCs w:val="24"/>
+        </w:rPr>
+        <w:t>quite</w:t>
+      </w:r>
+      <w:proofErr w:type="spellEnd"/>
+      <w:r>
+        <w:rPr>
+          <w:sz w:val="24"/>
+          <w:szCs w:val="24"/>
+        </w:rPr>
+        <w:t xml:space="preserve"> good, the </w:t>
+      </w:r>
+      <w:proofErr w:type="spellStart"/>
+      <w:r>
+        <w:rPr>
+          <w:sz w:val="24"/>
+          <w:szCs w:val="24"/>
+        </w:rPr>
+        <w:t>only</w:t>
+      </w:r>
+      <w:proofErr w:type="spellEnd"/>
+      <w:r>
+        <w:rPr>
+          <w:sz w:val="24"/>
+          <w:szCs w:val="24"/>
+        </w:rPr>
+        <w:t xml:space="preserve"> </w:t>
+      </w:r>
+      <w:proofErr w:type="spellStart"/>
+      <w:r>
+        <w:rPr>
+          <w:sz w:val="24"/>
+          <w:szCs w:val="24"/>
+        </w:rPr>
+        <w:t>mistakes</w:t>
+      </w:r>
+      <w:proofErr w:type="spellEnd"/>
+      <w:r>
+        <w:rPr>
+          <w:sz w:val="24"/>
+          <w:szCs w:val="24"/>
+        </w:rPr>
+        <w:t xml:space="preserve"> are on </w:t>
+      </w:r>
+      <w:proofErr w:type="spellStart"/>
+      <w:r>
+        <w:rPr>
+          <w:sz w:val="24"/>
+          <w:szCs w:val="24"/>
+        </w:rPr>
+        <w:t>ambiguous</w:t>
+      </w:r>
+      <w:proofErr w:type="spellEnd"/>
+      <w:r>
+        <w:rPr>
+          <w:sz w:val="24"/>
+          <w:szCs w:val="24"/>
+        </w:rPr>
+        <w:t xml:space="preserve"> data.</w:t>
       </w:r>
     </w:p>
     <w:p>
@@ -181,6 +1322,729 @@
           <w:szCs w:val="24"/>
         </w:rPr>
       </w:pPr>
+      <w:r>
+        <w:rPr>
+          <w:b/>
+          <w:sz w:val="24"/>
+          <w:szCs w:val="24"/>
+        </w:rPr>
+        <w:t>Simulated_data.py</w:t>
+      </w:r>
+      <w:r>
+        <w:rPr>
+          <w:b/>
+          <w:sz w:val="24"/>
+          <w:szCs w:val="24"/>
+        </w:rPr>
+        <w:t> :</w:t>
+      </w:r>
+      <w:r>
+        <w:rPr>
+          <w:sz w:val="24"/>
+          <w:szCs w:val="24"/>
+        </w:rPr>
+        <w:t xml:space="preserve"> to </w:t>
+      </w:r>
+      <w:proofErr w:type="spellStart"/>
+      <w:r>
+        <w:rPr>
+          <w:sz w:val="24"/>
+          <w:szCs w:val="24"/>
+        </w:rPr>
+        <w:t>be</w:t>
+      </w:r>
+      <w:proofErr w:type="spellEnd"/>
+      <w:r>
+        <w:rPr>
+          <w:sz w:val="24"/>
+          <w:szCs w:val="24"/>
+        </w:rPr>
+        <w:t xml:space="preserve"> able to train a 3 classes classifier </w:t>
+      </w:r>
+      <w:proofErr w:type="spellStart"/>
+      <w:r>
+        <w:rPr>
+          <w:sz w:val="24"/>
+          <w:szCs w:val="24"/>
+        </w:rPr>
+        <w:t>with</w:t>
+      </w:r>
+      <w:proofErr w:type="spellEnd"/>
+      <w:r>
+        <w:rPr>
+          <w:sz w:val="24"/>
+          <w:szCs w:val="24"/>
+        </w:rPr>
+        <w:t xml:space="preserve"> </w:t>
+      </w:r>
+      <w:proofErr w:type="spellStart"/>
+      <w:r>
+        <w:rPr>
+          <w:sz w:val="24"/>
+          <w:szCs w:val="24"/>
+        </w:rPr>
+        <w:t>enough</w:t>
+      </w:r>
+      <w:proofErr w:type="spellEnd"/>
+      <w:r>
+        <w:rPr>
+          <w:sz w:val="24"/>
+          <w:szCs w:val="24"/>
+        </w:rPr>
+        <w:t xml:space="preserve"> data for the </w:t>
+      </w:r>
+      <w:proofErr w:type="spellStart"/>
+      <w:r>
+        <w:rPr>
+          <w:sz w:val="24"/>
+          <w:szCs w:val="24"/>
+        </w:rPr>
+        <w:t>third</w:t>
+      </w:r>
+      <w:proofErr w:type="spellEnd"/>
+      <w:r>
+        <w:rPr>
+          <w:sz w:val="24"/>
+          <w:szCs w:val="24"/>
+        </w:rPr>
+        <w:t xml:space="preserve"> class and </w:t>
+      </w:r>
+      <w:proofErr w:type="spellStart"/>
+      <w:r>
+        <w:rPr>
+          <w:sz w:val="24"/>
+          <w:szCs w:val="24"/>
+        </w:rPr>
+        <w:t>without</w:t>
+      </w:r>
+      <w:proofErr w:type="spellEnd"/>
+      <w:r>
+        <w:rPr>
+          <w:sz w:val="24"/>
+          <w:szCs w:val="24"/>
+        </w:rPr>
+        <w:t xml:space="preserve"> </w:t>
+      </w:r>
+      <w:proofErr w:type="spellStart"/>
+      <w:r>
+        <w:rPr>
+          <w:sz w:val="24"/>
+          <w:szCs w:val="24"/>
+        </w:rPr>
+        <w:t>problems</w:t>
+      </w:r>
+      <w:proofErr w:type="spellEnd"/>
+      <w:r>
+        <w:rPr>
+          <w:sz w:val="24"/>
+          <w:szCs w:val="24"/>
+        </w:rPr>
+        <w:t xml:space="preserve"> of false labelling, </w:t>
+      </w:r>
+      <w:proofErr w:type="spellStart"/>
+      <w:r>
+        <w:rPr>
+          <w:sz w:val="24"/>
+          <w:szCs w:val="24"/>
+        </w:rPr>
+        <w:t>we</w:t>
+      </w:r>
+      <w:proofErr w:type="spellEnd"/>
+      <w:r>
+        <w:rPr>
+          <w:sz w:val="24"/>
+          <w:szCs w:val="24"/>
+        </w:rPr>
+        <w:t xml:space="preserve"> </w:t>
+      </w:r>
+      <w:proofErr w:type="spellStart"/>
+      <w:r>
+        <w:rPr>
+          <w:sz w:val="24"/>
+          <w:szCs w:val="24"/>
+        </w:rPr>
+        <w:t>can</w:t>
+      </w:r>
+      <w:proofErr w:type="spellEnd"/>
+      <w:r>
+        <w:rPr>
+          <w:sz w:val="24"/>
+          <w:szCs w:val="24"/>
+        </w:rPr>
+        <w:t xml:space="preserve"> use </w:t>
+      </w:r>
+      <w:proofErr w:type="spellStart"/>
+      <w:r>
+        <w:rPr>
+          <w:sz w:val="24"/>
+          <w:szCs w:val="24"/>
+        </w:rPr>
+        <w:t>simulated</w:t>
+      </w:r>
+      <w:proofErr w:type="spellEnd"/>
+      <w:r>
+        <w:rPr>
+          <w:sz w:val="24"/>
+          <w:szCs w:val="24"/>
+        </w:rPr>
+        <w:t xml:space="preserve"> data. </w:t>
+      </w:r>
+    </w:p>
+    <w:p>
+      <w:pPr>
+        <w:rPr>
+          <w:sz w:val="24"/>
+          <w:szCs w:val="24"/>
+        </w:rPr>
+      </w:pPr>
+      <w:r>
+        <w:rPr>
+          <w:sz w:val="24"/>
+          <w:szCs w:val="24"/>
+        </w:rPr>
+        <w:t xml:space="preserve">This code </w:t>
+      </w:r>
+      <w:proofErr w:type="spellStart"/>
+      <w:r>
+        <w:rPr>
+          <w:sz w:val="24"/>
+          <w:szCs w:val="24"/>
+        </w:rPr>
+        <w:t>saves</w:t>
+      </w:r>
+      <w:proofErr w:type="spellEnd"/>
+      <w:r>
+        <w:rPr>
+          <w:sz w:val="24"/>
+          <w:szCs w:val="24"/>
+        </w:rPr>
+        <w:t xml:space="preserve"> </w:t>
+      </w:r>
+      <w:proofErr w:type="spellStart"/>
+      <w:r>
+        <w:rPr>
+          <w:sz w:val="24"/>
+          <w:szCs w:val="24"/>
+        </w:rPr>
+        <w:t>tiff</w:t>
+      </w:r>
+      <w:proofErr w:type="spellEnd"/>
+      <w:r>
+        <w:rPr>
+          <w:sz w:val="24"/>
+          <w:szCs w:val="24"/>
+        </w:rPr>
+        <w:t xml:space="preserve"> images </w:t>
+      </w:r>
+      <w:proofErr w:type="spellStart"/>
+      <w:r>
+        <w:rPr>
+          <w:sz w:val="24"/>
+          <w:szCs w:val="24"/>
+        </w:rPr>
+        <w:t>from</w:t>
+      </w:r>
+      <w:proofErr w:type="spellEnd"/>
+      <w:r>
+        <w:rPr>
+          <w:sz w:val="24"/>
+          <w:szCs w:val="24"/>
+        </w:rPr>
+        <w:t xml:space="preserve">  </w:t>
+      </w:r>
+      <w:proofErr w:type="spellStart"/>
+      <w:r>
+        <w:rPr>
+          <w:sz w:val="24"/>
+          <w:szCs w:val="24"/>
+        </w:rPr>
+        <w:t>cloud</w:t>
+      </w:r>
+      <w:proofErr w:type="spellEnd"/>
+      <w:r>
+        <w:rPr>
+          <w:sz w:val="24"/>
+          <w:szCs w:val="24"/>
+        </w:rPr>
+        <w:t xml:space="preserve"> of points </w:t>
+      </w:r>
+      <w:proofErr w:type="spellStart"/>
+      <w:r>
+        <w:rPr>
+          <w:sz w:val="24"/>
+          <w:szCs w:val="24"/>
+        </w:rPr>
+        <w:t>representing</w:t>
+      </w:r>
+      <w:proofErr w:type="spellEnd"/>
+      <w:r>
+        <w:rPr>
+          <w:sz w:val="24"/>
+          <w:szCs w:val="24"/>
+        </w:rPr>
+        <w:t xml:space="preserve"> centrioles. </w:t>
+      </w:r>
+      <w:proofErr w:type="spellStart"/>
+      <w:r>
+        <w:rPr>
+          <w:sz w:val="24"/>
+          <w:szCs w:val="24"/>
+        </w:rPr>
+        <w:t>They</w:t>
+      </w:r>
+      <w:proofErr w:type="spellEnd"/>
+      <w:r>
+        <w:rPr>
+          <w:sz w:val="24"/>
+          <w:szCs w:val="24"/>
+        </w:rPr>
+        <w:t xml:space="preserve">  </w:t>
+      </w:r>
+      <w:proofErr w:type="spellStart"/>
+      <w:r>
+        <w:rPr>
+          <w:sz w:val="24"/>
+          <w:szCs w:val="24"/>
+        </w:rPr>
+        <w:t>should</w:t>
+      </w:r>
+      <w:proofErr w:type="spellEnd"/>
+      <w:r>
+        <w:rPr>
+          <w:sz w:val="24"/>
+          <w:szCs w:val="24"/>
+        </w:rPr>
+        <w:t xml:space="preserve"> </w:t>
+      </w:r>
+      <w:proofErr w:type="spellStart"/>
+      <w:r>
+        <w:rPr>
+          <w:sz w:val="24"/>
+          <w:szCs w:val="24"/>
+        </w:rPr>
+        <w:t>be</w:t>
+      </w:r>
+      <w:proofErr w:type="spellEnd"/>
+      <w:r>
+        <w:rPr>
+          <w:sz w:val="24"/>
+          <w:szCs w:val="24"/>
+        </w:rPr>
+        <w:t xml:space="preserve"> </w:t>
+      </w:r>
+      <w:proofErr w:type="spellStart"/>
+      <w:r>
+        <w:rPr>
+          <w:sz w:val="24"/>
+          <w:szCs w:val="24"/>
+        </w:rPr>
+        <w:t>given</w:t>
+      </w:r>
+      <w:proofErr w:type="spellEnd"/>
+      <w:r>
+        <w:rPr>
+          <w:sz w:val="24"/>
+          <w:szCs w:val="24"/>
+        </w:rPr>
+        <w:t xml:space="preserve"> in .csv file. </w:t>
+      </w:r>
+      <w:proofErr w:type="spellStart"/>
+      <w:r>
+        <w:rPr>
+          <w:sz w:val="24"/>
+          <w:szCs w:val="24"/>
+        </w:rPr>
+        <w:t>Associated</w:t>
+      </w:r>
+      <w:proofErr w:type="spellEnd"/>
+      <w:r>
+        <w:rPr>
+          <w:sz w:val="24"/>
+          <w:szCs w:val="24"/>
+        </w:rPr>
+        <w:t xml:space="preserve"> angles </w:t>
+      </w:r>
+      <w:proofErr w:type="spellStart"/>
+      <w:r>
+        <w:rPr>
+          <w:sz w:val="24"/>
+          <w:szCs w:val="24"/>
+        </w:rPr>
+        <w:t>around</w:t>
+      </w:r>
+      <w:proofErr w:type="spellEnd"/>
+      <w:r>
+        <w:rPr>
+          <w:sz w:val="24"/>
+          <w:szCs w:val="24"/>
+        </w:rPr>
+        <w:t xml:space="preserve"> x axis </w:t>
+      </w:r>
+      <w:proofErr w:type="spellStart"/>
+      <w:r>
+        <w:rPr>
+          <w:sz w:val="24"/>
+          <w:szCs w:val="24"/>
+        </w:rPr>
+        <w:t>should</w:t>
+      </w:r>
+      <w:proofErr w:type="spellEnd"/>
+      <w:r>
+        <w:rPr>
+          <w:sz w:val="24"/>
+          <w:szCs w:val="24"/>
+        </w:rPr>
+        <w:t xml:space="preserve"> </w:t>
+      </w:r>
+      <w:proofErr w:type="spellStart"/>
+      <w:r>
+        <w:rPr>
+          <w:sz w:val="24"/>
+          <w:szCs w:val="24"/>
+        </w:rPr>
+        <w:t>also</w:t>
+      </w:r>
+      <w:proofErr w:type="spellEnd"/>
+      <w:r>
+        <w:rPr>
+          <w:sz w:val="24"/>
+          <w:szCs w:val="24"/>
+        </w:rPr>
+        <w:t xml:space="preserve"> </w:t>
+      </w:r>
+      <w:proofErr w:type="spellStart"/>
+      <w:r>
+        <w:rPr>
+          <w:sz w:val="24"/>
+          <w:szCs w:val="24"/>
+        </w:rPr>
+        <w:t>be</w:t>
+      </w:r>
+      <w:proofErr w:type="spellEnd"/>
+      <w:r>
+        <w:rPr>
+          <w:sz w:val="24"/>
+          <w:szCs w:val="24"/>
+        </w:rPr>
+        <w:t xml:space="preserve"> </w:t>
+      </w:r>
+      <w:proofErr w:type="spellStart"/>
+      <w:r>
+        <w:rPr>
+          <w:sz w:val="24"/>
+          <w:szCs w:val="24"/>
+        </w:rPr>
+        <w:t>given</w:t>
+      </w:r>
+      <w:proofErr w:type="spellEnd"/>
+      <w:r>
+        <w:rPr>
+          <w:sz w:val="24"/>
+          <w:szCs w:val="24"/>
+        </w:rPr>
+        <w:t xml:space="preserve"> in </w:t>
+      </w:r>
+      <w:proofErr w:type="gramStart"/>
+      <w:r>
+        <w:rPr>
+          <w:sz w:val="24"/>
+          <w:szCs w:val="24"/>
+        </w:rPr>
+        <w:t>a</w:t>
+      </w:r>
+      <w:proofErr w:type="gramEnd"/>
+      <w:r>
+        <w:rPr>
+          <w:sz w:val="24"/>
+          <w:szCs w:val="24"/>
+        </w:rPr>
+        <w:t xml:space="preserve"> .csv file. </w:t>
+      </w:r>
+    </w:p>
+    <w:p>
+      <w:pPr>
+        <w:rPr>
+          <w:sz w:val="24"/>
+          <w:szCs w:val="24"/>
+        </w:rPr>
+      </w:pPr>
+      <w:r>
+        <w:rPr>
+          <w:sz w:val="24"/>
+          <w:szCs w:val="24"/>
+        </w:rPr>
+        <w:t xml:space="preserve">The class </w:t>
+      </w:r>
+      <w:proofErr w:type="spellStart"/>
+      <w:r>
+        <w:rPr>
+          <w:sz w:val="24"/>
+          <w:szCs w:val="24"/>
+        </w:rPr>
+        <w:t>Clould_of_points</w:t>
+      </w:r>
+      <w:proofErr w:type="spellEnd"/>
+      <w:r>
+        <w:rPr>
+          <w:sz w:val="24"/>
+          <w:szCs w:val="24"/>
+        </w:rPr>
+        <w:t xml:space="preserve"> has </w:t>
+      </w:r>
+      <w:proofErr w:type="gramStart"/>
+      <w:r>
+        <w:rPr>
+          <w:sz w:val="24"/>
+          <w:szCs w:val="24"/>
+        </w:rPr>
+        <w:t>a</w:t>
+      </w:r>
+      <w:proofErr w:type="gramEnd"/>
+      <w:r>
+        <w:rPr>
+          <w:sz w:val="24"/>
+          <w:szCs w:val="24"/>
+        </w:rPr>
+        <w:t xml:space="preserve"> </w:t>
+      </w:r>
+      <w:proofErr w:type="spellStart"/>
+      <w:r>
+        <w:rPr>
+          <w:sz w:val="24"/>
+          <w:szCs w:val="24"/>
+        </w:rPr>
+        <w:t>method</w:t>
+      </w:r>
+      <w:proofErr w:type="spellEnd"/>
+      <w:r>
+        <w:rPr>
+          <w:sz w:val="24"/>
+          <w:szCs w:val="24"/>
+        </w:rPr>
+        <w:t xml:space="preserve"> </w:t>
+      </w:r>
+      <w:proofErr w:type="spellStart"/>
+      <w:r>
+        <w:rPr>
+          <w:sz w:val="24"/>
+          <w:szCs w:val="24"/>
+        </w:rPr>
+        <w:t>rorotation_x_to</w:t>
+      </w:r>
+      <w:proofErr w:type="spellEnd"/>
+      <w:r>
+        <w:rPr>
+          <w:sz w:val="24"/>
+          <w:szCs w:val="24"/>
+        </w:rPr>
+        <w:t>(</w:t>
+      </w:r>
+      <w:r>
+        <w:rPr>
+          <w:i/>
+          <w:sz w:val="24"/>
+          <w:szCs w:val="24"/>
+        </w:rPr>
+        <w:t>a</w:t>
+      </w:r>
+      <w:r>
+        <w:rPr>
+          <w:sz w:val="24"/>
+          <w:szCs w:val="24"/>
+        </w:rPr>
+        <w:t xml:space="preserve">)  </w:t>
+      </w:r>
+      <w:proofErr w:type="spellStart"/>
+      <w:r>
+        <w:rPr>
+          <w:sz w:val="24"/>
+          <w:szCs w:val="24"/>
+        </w:rPr>
+        <w:t>which</w:t>
+      </w:r>
+      <w:proofErr w:type="spellEnd"/>
+      <w:r>
+        <w:rPr>
+          <w:sz w:val="24"/>
+          <w:szCs w:val="24"/>
+        </w:rPr>
+        <w:t xml:space="preserve"> </w:t>
+      </w:r>
+      <w:proofErr w:type="spellStart"/>
+      <w:r>
+        <w:rPr>
+          <w:sz w:val="24"/>
+          <w:szCs w:val="24"/>
+        </w:rPr>
+        <w:t>rotates</w:t>
+      </w:r>
+      <w:proofErr w:type="spellEnd"/>
+      <w:r>
+        <w:rPr>
+          <w:sz w:val="24"/>
+          <w:szCs w:val="24"/>
+        </w:rPr>
+        <w:t xml:space="preserve"> the </w:t>
+      </w:r>
+      <w:proofErr w:type="spellStart"/>
+      <w:r>
+        <w:rPr>
+          <w:sz w:val="24"/>
+          <w:szCs w:val="24"/>
+        </w:rPr>
+        <w:t>cloud</w:t>
+      </w:r>
+      <w:proofErr w:type="spellEnd"/>
+      <w:r>
+        <w:rPr>
+          <w:sz w:val="24"/>
+          <w:szCs w:val="24"/>
+        </w:rPr>
+        <w:t xml:space="preserve"> of points </w:t>
+      </w:r>
+      <w:proofErr w:type="spellStart"/>
+      <w:r>
+        <w:rPr>
+          <w:sz w:val="24"/>
+          <w:szCs w:val="24"/>
+        </w:rPr>
+        <w:t>so</w:t>
+      </w:r>
+      <w:proofErr w:type="spellEnd"/>
+      <w:r>
+        <w:rPr>
+          <w:sz w:val="24"/>
+          <w:szCs w:val="24"/>
+        </w:rPr>
+        <w:t xml:space="preserve"> </w:t>
+      </w:r>
+      <w:proofErr w:type="spellStart"/>
+      <w:r>
+        <w:rPr>
+          <w:sz w:val="24"/>
+          <w:szCs w:val="24"/>
+        </w:rPr>
+        <w:t>that</w:t>
+      </w:r>
+      <w:proofErr w:type="spellEnd"/>
+      <w:r>
+        <w:rPr>
+          <w:sz w:val="24"/>
+          <w:szCs w:val="24"/>
+        </w:rPr>
+        <w:t xml:space="preserve"> the </w:t>
+      </w:r>
+      <w:proofErr w:type="spellStart"/>
+      <w:r>
+        <w:rPr>
+          <w:sz w:val="24"/>
+          <w:szCs w:val="24"/>
+        </w:rPr>
+        <w:t>resulting</w:t>
+      </w:r>
+      <w:proofErr w:type="spellEnd"/>
+      <w:r>
+        <w:rPr>
+          <w:sz w:val="24"/>
+          <w:szCs w:val="24"/>
+        </w:rPr>
+        <w:t xml:space="preserve"> angle </w:t>
+      </w:r>
+      <w:proofErr w:type="spellStart"/>
+      <w:r>
+        <w:rPr>
+          <w:sz w:val="24"/>
+          <w:szCs w:val="24"/>
+        </w:rPr>
+        <w:t>is</w:t>
+      </w:r>
+      <w:proofErr w:type="spellEnd"/>
+      <w:r>
+        <w:rPr>
+          <w:sz w:val="24"/>
+          <w:szCs w:val="24"/>
+        </w:rPr>
+        <w:t xml:space="preserve"> </w:t>
+      </w:r>
+      <w:r>
+        <w:rPr>
+          <w:i/>
+          <w:sz w:val="24"/>
+          <w:szCs w:val="24"/>
+        </w:rPr>
+        <w:t>a</w:t>
+      </w:r>
+      <w:r>
+        <w:rPr>
+          <w:sz w:val="24"/>
+          <w:szCs w:val="24"/>
+        </w:rPr>
+        <w:t xml:space="preserve">. It </w:t>
+      </w:r>
+      <w:proofErr w:type="spellStart"/>
+      <w:r>
+        <w:rPr>
+          <w:sz w:val="24"/>
+          <w:szCs w:val="24"/>
+        </w:rPr>
+        <w:t>allows</w:t>
+      </w:r>
+      <w:proofErr w:type="spellEnd"/>
+      <w:r>
+        <w:rPr>
+          <w:sz w:val="24"/>
+          <w:szCs w:val="24"/>
+        </w:rPr>
+        <w:t xml:space="preserve"> us to </w:t>
+      </w:r>
+      <w:proofErr w:type="spellStart"/>
+      <w:r>
+        <w:rPr>
+          <w:sz w:val="24"/>
+          <w:szCs w:val="24"/>
+        </w:rPr>
+        <w:t>choose</w:t>
+      </w:r>
+      <w:proofErr w:type="spellEnd"/>
+      <w:r>
+        <w:rPr>
+          <w:sz w:val="24"/>
+          <w:szCs w:val="24"/>
+        </w:rPr>
+        <w:t xml:space="preserve"> the angle for </w:t>
+      </w:r>
+      <w:proofErr w:type="spellStart"/>
+      <w:r>
+        <w:rPr>
+          <w:sz w:val="24"/>
+          <w:szCs w:val="24"/>
+        </w:rPr>
+        <w:t>each</w:t>
+      </w:r>
+      <w:proofErr w:type="spellEnd"/>
+      <w:r>
+        <w:rPr>
+          <w:sz w:val="24"/>
+          <w:szCs w:val="24"/>
+        </w:rPr>
+        <w:t xml:space="preserve"> </w:t>
+      </w:r>
+      <w:proofErr w:type="spellStart"/>
+      <w:r>
+        <w:rPr>
+          <w:sz w:val="24"/>
+          <w:szCs w:val="24"/>
+        </w:rPr>
+        <w:t>simulated</w:t>
+      </w:r>
+      <w:proofErr w:type="spellEnd"/>
+      <w:r>
+        <w:rPr>
+          <w:sz w:val="24"/>
+          <w:szCs w:val="24"/>
+        </w:rPr>
+        <w:t xml:space="preserve"> centriole.</w:t>
+      </w:r>
     </w:p>
     <w:p>
       <w:pPr>

</xml_diff>